<commit_message>
Changed LRU to pseudoLRU in test plan
</commit_message>
<xml_diff>
--- a/testplan_finalproject7_ece485-585.docx
+++ b/testplan_finalproject7_ece485-585.docx
@@ -306,7 +306,7 @@
           <w:szCs w:val="24"/>
           <w:rtl w:val="0"/>
         </w:rPr>
-        <w:t xml:space="preserve"> Read requests should result in correctly identifying whether the address requested is present in the cache, and should increment the cache miss or cache hit counter by 1 (as appropriate) as well as incrementing the cache read counter. Requesting data not in the cache that conflicts with data in the cache should result in the old data being evicted per an LRU replacement policy. Tests should include addresses absent from the cache, addresses present in the cache, addresses recently evicted from the cache, and maximum and minimum valid addresses.</w:t>
+        <w:t xml:space="preserve"> Read requests should result in correctly identifying whether the address requested is present in the cache, and should increment the cache miss or cache hit counter by 1 (as appropriate) as well as incrementing the cache read counter. Requesting data not in the cache that conflicts with data in the cache should result in the old data being evicted per a pseudo-LRU replacement policy. Tests should include addresses absent from the cache, addresses present in the cache, addresses recently evicted from the cache, and maximum and minimum valid addresses.</w:t>
       </w:r>
     </w:p>
     <w:p>
@@ -339,7 +339,7 @@
           <w:szCs w:val="24"/>
           <w:rtl w:val="0"/>
         </w:rPr>
-        <w:t xml:space="preserve"> Write requests should result in correctly identifying the location in the cache to write to, measured by whether or not that location in the cache changes after the request. A request should evict conflicting data and follow an LRU replacement policy. A request should increment the cache write counter by 1, as well as incrementing the cache miss or cache hit counter by 1 (as appropriate). Tests should include addresses absent from the cache, addresses present in the cache, addresses recently evicted from the cache, and maximum and minimum valid addresses.</w:t>
+        <w:t xml:space="preserve"> Write requests should result in correctly identifying the location in the cache to write to, measured by whether or not that location in the cache changes after the request. A request should evict conflicting data and follow a pseudo-LRU replacement policy. A request should increment the cache write counter by 1, as well as incrementing the cache miss or cache hit counter by 1 (as appropriate). Tests should include addresses absent from the cache, addresses present in the cache, addresses recently evicted from the cache, and maximum and minimum valid addresses.</w:t>
       </w:r>
     </w:p>
     <w:p>

</xml_diff>